<commit_message>
docs: populate student and faculty details in academic documents
</commit_message>
<xml_diff>
--- a/CampusNotify_Problem_Statement_Synopsis.docx
+++ b/CampusNotify_Problem_Statement_Synopsis.docx
@@ -200,7 +200,7 @@
     </w:tbl>
     <w:p>
       <w:pPr>
-        <w:spacing w:after="280" w:before="200" w:line="276" w:lineRule="auto"/>
+        <w:spacing w:after="200" w:before="160" w:line="276" w:lineRule="auto"/>
         <w:jc w:val="right"/>
       </w:pPr>
       <w:r>
@@ -216,7 +216,7 @@
     </w:p>
     <w:p>
       <w:pPr>
-        <w:spacing w:after="80" w:before="0" w:line="276" w:lineRule="auto"/>
+        <w:spacing w:after="60" w:before="0" w:line="276" w:lineRule="auto"/>
         <w:jc w:val="center"/>
       </w:pPr>
       <w:r>
@@ -232,7 +232,7 @@
     </w:p>
     <w:p>
       <w:pPr>
-        <w:spacing w:after="240" w:before="0" w:line="276" w:lineRule="auto"/>
+        <w:spacing w:after="200" w:before="0" w:line="276" w:lineRule="auto"/>
         <w:jc w:val="center"/>
       </w:pPr>
       <w:r>
@@ -243,7 +243,7 @@
           <w:color w:val="000000"/>
           <w:sz w:val="22"/>
         </w:rPr>
-        <w:t>SUBMITTED BY: SE IT DIV B</w:t>
+        <w:t>SUBMITTED BY: SE(IT) DIV :- A BATCH :- C</w:t>
       </w:r>
     </w:p>
     <w:tbl>
@@ -317,7 +317,7 @@
                 <w:color w:val="000000"/>
                 <w:sz w:val="22"/>
               </w:rPr>
-              <w:t>VU4F2425 - ____________________</w:t>
+              <w:t>VU4F2526072 - PRATIK ATPADKAR</w:t>
             </w:r>
           </w:p>
         </w:tc>
@@ -383,7 +383,7 @@
                 <w:color w:val="000000"/>
                 <w:sz w:val="22"/>
               </w:rPr>
-              <w:t>VU4F2425 - ____________________</w:t>
+              <w:t>VU4F2526066 - HARSH TIWAR</w:t>
             </w:r>
           </w:p>
         </w:tc>
@@ -449,73 +449,7 @@
                 <w:color w:val="000000"/>
                 <w:sz w:val="22"/>
               </w:rPr>
-              <w:t>VU4F2425 - ____________________</w:t>
-            </w:r>
-          </w:p>
-        </w:tc>
-      </w:tr>
-      <w:tr>
-        <w:tc>
-          <w:tcPr>
-            <w:tcW w:type="dxa" w:w="2160"/>
-            <w:tcBorders>
-              <w:top w:val="none"/>
-              <w:bottom w:val="none"/>
-              <w:left w:val="none"/>
-              <w:right w:val="none"/>
-            </w:tcBorders>
-            <w:tcMar>
-              <w:top w:w="20" w:type="dxa"/>
-              <w:bottom w:w="20" w:type="dxa"/>
-              <w:left w:w="40" w:type="dxa"/>
-              <w:right w:w="40" w:type="dxa"/>
-            </w:tcMar>
-          </w:tcPr>
-          <w:p>
-            <w:pPr>
-              <w:spacing w:after="40"/>
-            </w:pPr>
-            <w:r>
-              <w:rPr>
-                <w:rFonts w:ascii="Times New Roman" w:hAnsi="Times New Roman"/>
-                <w:b/>
-                <w:i w:val="0"/>
-                <w:color w:val="000000"/>
-                <w:sz w:val="22"/>
-              </w:rPr>
-              <w:t>Student 4:</w:t>
-            </w:r>
-          </w:p>
-        </w:tc>
-        <w:tc>
-          <w:tcPr>
-            <w:tcW w:type="dxa" w:w="6480"/>
-            <w:tcBorders>
-              <w:top w:val="none"/>
-              <w:bottom w:val="none"/>
-              <w:left w:val="none"/>
-              <w:right w:val="none"/>
-            </w:tcBorders>
-            <w:tcMar>
-              <w:top w:w="20" w:type="dxa"/>
-              <w:bottom w:w="20" w:type="dxa"/>
-              <w:left w:w="40" w:type="dxa"/>
-              <w:right w:w="40" w:type="dxa"/>
-            </w:tcMar>
-          </w:tcPr>
-          <w:p>
-            <w:pPr>
-              <w:spacing w:after="40"/>
-            </w:pPr>
-            <w:r>
-              <w:rPr>
-                <w:rFonts w:ascii="Times New Roman" w:hAnsi="Times New Roman"/>
-                <w:b w:val="0"/>
-                <w:i w:val="0"/>
-                <w:color w:val="000000"/>
-                <w:sz w:val="22"/>
-              </w:rPr>
-              <w:t>VU4F2425 - ____________________</w:t>
+              <w:t>VU4F2526062 - PARTH GADADHE</w:t>
             </w:r>
           </w:p>
         </w:tc>
@@ -523,13 +457,13 @@
     </w:tbl>
     <w:p>
       <w:pPr>
-        <w:spacing w:after="160" w:before="0" w:line="276" w:lineRule="auto"/>
+        <w:spacing w:after="120" w:before="0" w:line="276" w:lineRule="auto"/>
         <w:jc w:val="left"/>
       </w:pPr>
     </w:p>
     <w:p>
       <w:pPr>
-        <w:spacing w:after="60" w:before="160" w:line="276" w:lineRule="auto"/>
+        <w:spacing w:after="60" w:before="120" w:line="276" w:lineRule="auto"/>
         <w:jc w:val="left"/>
       </w:pPr>
       <w:r>
@@ -545,7 +479,7 @@
     </w:p>
     <w:p>
       <w:pPr>
-        <w:spacing w:after="160" w:before="0" w:line="276" w:lineRule="auto"/>
+        <w:spacing w:after="120" w:before="0" w:line="276" w:lineRule="auto"/>
         <w:jc w:val="left"/>
       </w:pPr>
       <w:r>
@@ -561,7 +495,7 @@
     </w:p>
     <w:p>
       <w:pPr>
-        <w:spacing w:after="60" w:before="160" w:line="276" w:lineRule="auto"/>
+        <w:spacing w:after="60" w:before="120" w:line="276" w:lineRule="auto"/>
         <w:jc w:val="left"/>
       </w:pPr>
       <w:r>
@@ -577,7 +511,7 @@
     </w:p>
     <w:p>
       <w:pPr>
-        <w:spacing w:after="100" w:before="0" w:line="276" w:lineRule="auto"/>
+        <w:spacing w:after="80" w:before="0" w:line="276" w:lineRule="auto"/>
         <w:jc w:val="left"/>
       </w:pPr>
       <w:r>
@@ -593,7 +527,7 @@
     </w:p>
     <w:p>
       <w:pPr>
-        <w:spacing w:after="100" w:before="0" w:line="276" w:lineRule="auto"/>
+        <w:spacing w:after="80" w:before="0" w:line="276" w:lineRule="auto"/>
         <w:jc w:val="left"/>
       </w:pPr>
       <w:r>
@@ -609,7 +543,7 @@
     </w:p>
     <w:p>
       <w:pPr>
-        <w:spacing w:after="160" w:before="0" w:line="276" w:lineRule="auto"/>
+        <w:spacing w:after="120" w:before="0" w:line="276" w:lineRule="auto"/>
         <w:jc w:val="left"/>
       </w:pPr>
       <w:r>
@@ -624,8 +558,13 @@
       </w:r>
     </w:p>
     <w:p>
+      <w:r>
+        <w:br w:type="page"/>
+      </w:r>
+    </w:p>
+    <w:p>
       <w:pPr>
-        <w:spacing w:after="60" w:before="160" w:line="276" w:lineRule="auto"/>
+        <w:spacing w:after="80" w:before="120" w:line="276" w:lineRule="auto"/>
         <w:jc w:val="left"/>
       </w:pPr>
       <w:r>
@@ -821,7 +760,7 @@
     </w:p>
     <w:p>
       <w:pPr>
-        <w:spacing w:after="60" w:before="160" w:line="276" w:lineRule="auto"/>
+        <w:spacing w:after="80" w:before="160" w:line="276" w:lineRule="auto"/>
         <w:jc w:val="left"/>
       </w:pPr>
       <w:r>
@@ -933,7 +872,7 @@
     </w:p>
     <w:p>
       <w:pPr>
-        <w:spacing w:after="60" w:before="160" w:line="276" w:lineRule="auto"/>
+        <w:spacing w:after="80" w:before="160" w:line="276" w:lineRule="auto"/>
         <w:jc w:val="left"/>
       </w:pPr>
       <w:r>
@@ -949,7 +888,7 @@
     </w:p>
     <w:p>
       <w:pPr>
-        <w:spacing w:after="100" w:before="0" w:line="276" w:lineRule="auto"/>
+        <w:spacing w:after="80" w:before="0" w:line="276" w:lineRule="auto"/>
         <w:jc w:val="left"/>
       </w:pPr>
       <w:r>
@@ -965,7 +904,7 @@
     </w:p>
     <w:p>
       <w:pPr>
-        <w:spacing w:after="160" w:before="0" w:line="276" w:lineRule="auto"/>
+        <w:spacing w:after="120" w:before="0" w:line="276" w:lineRule="auto"/>
         <w:jc w:val="left"/>
       </w:pPr>
       <w:r>
@@ -980,8 +919,13 @@
       </w:r>
     </w:p>
     <w:p>
+      <w:r>
+        <w:br w:type="page"/>
+      </w:r>
+    </w:p>
+    <w:p>
       <w:pPr>
-        <w:spacing w:after="120" w:before="280" w:line="276" w:lineRule="auto"/>
+        <w:spacing w:after="80" w:before="120" w:line="276" w:lineRule="auto"/>
         <w:jc w:val="left"/>
       </w:pPr>
       <w:r>
@@ -992,7 +936,364 @@
           <w:color w:val="000000"/>
           <w:sz w:val="24"/>
         </w:rPr>
-        <w:t>6. Signatures and Approvals</w:t>
+        <w:t>6. Proposed Solution / Approach</w:t>
+      </w:r>
+    </w:p>
+    <w:p>
+      <w:pPr>
+        <w:spacing w:after="80" w:before="0" w:line="276" w:lineRule="auto"/>
+        <w:jc w:val="left"/>
+      </w:pPr>
+      <w:r>
+        <w:rPr>
+          <w:rFonts w:ascii="Times New Roman" w:hAnsi="Times New Roman"/>
+          <w:b w:val="0"/>
+          <w:i w:val="0"/>
+          <w:color w:val="000000"/>
+          <w:sz w:val="22"/>
+        </w:rPr>
+        <w:t>The proposed solution is a modular, multi-tier notification management system developed using Core Java object-oriented principles. Object-Oriented Programming is used to encapsulate domain entities (User, Notification), enforcing private data members and public getter/setter mutators.</w:t>
+      </w:r>
+    </w:p>
+    <w:p>
+      <w:pPr>
+        <w:spacing w:after="80" w:before="0" w:line="276" w:lineRule="auto"/>
+        <w:jc w:val="left"/>
+      </w:pPr>
+      <w:r>
+        <w:rPr>
+          <w:rFonts w:ascii="Times New Roman" w:hAnsi="Times New Roman"/>
+          <w:b w:val="0"/>
+          <w:i w:val="0"/>
+          <w:color w:val="000000"/>
+          <w:sz w:val="22"/>
+        </w:rPr>
+        <w:t>A dedicated business controller (NotificationManager) manages in-memory circular lists using the Java Collections Framework (ArrayList), safe traversal with Iterator, and delimited file persistence (BufferedReader / PrintWriter) to guarantee zero data loss. Role-Based Access Control (RBAC) ensures only authorized administrators and faculty can issue or purge notices, while students enjoy read-only feeds with interactive search and category filtering.</w:t>
+      </w:r>
+    </w:p>
+    <w:p>
+      <w:pPr>
+        <w:spacing w:after="120" w:before="0" w:line="276" w:lineRule="auto"/>
+        <w:jc w:val="left"/>
+      </w:pPr>
+      <w:r>
+        <w:rPr>
+          <w:rFonts w:ascii="Times New Roman" w:hAnsi="Times New Roman"/>
+          <w:b w:val="0"/>
+          <w:i w:val="0"/>
+          <w:color w:val="000000"/>
+          <w:sz w:val="22"/>
+        </w:rPr>
+        <w:t>To bridge laboratory Java concepts with modern industry application, a responsive web dashboard is integrated alongside the terminal CLI, connecting to Google Firebase for real-time cloud sync with automatic offline local storage fallback.</w:t>
+      </w:r>
+    </w:p>
+    <w:p>
+      <w:pPr>
+        <w:spacing w:after="80" w:before="160" w:line="276" w:lineRule="auto"/>
+        <w:jc w:val="left"/>
+      </w:pPr>
+      <w:r>
+        <w:rPr>
+          <w:rFonts w:ascii="Times New Roman" w:hAnsi="Times New Roman"/>
+          <w:b/>
+          <w:i w:val="0"/>
+          <w:color w:val="000000"/>
+          <w:sz w:val="24"/>
+        </w:rPr>
+        <w:t>7. Expected Outcome</w:t>
+      </w:r>
+    </w:p>
+    <w:p>
+      <w:pPr>
+        <w:spacing w:after="60" w:before="0" w:line="276" w:lineRule="auto"/>
+        <w:jc w:val="left"/>
+      </w:pPr>
+      <w:r>
+        <w:rPr>
+          <w:rFonts w:ascii="Times New Roman" w:hAnsi="Times New Roman"/>
+          <w:b w:val="0"/>
+          <w:i w:val="0"/>
+          <w:color w:val="000000"/>
+          <w:sz w:val="22"/>
+        </w:rPr>
+        <w:t>•  Automated, authentic dissemination of official campus circulars with zero unauthorized notice tampering.</w:t>
+      </w:r>
+    </w:p>
+    <w:p>
+      <w:pPr>
+        <w:spacing w:after="60" w:before="0" w:line="276" w:lineRule="auto"/>
+        <w:jc w:val="left"/>
+      </w:pPr>
+      <w:r>
+        <w:rPr>
+          <w:rFonts w:ascii="Times New Roman" w:hAnsi="Times New Roman"/>
+          <w:b w:val="0"/>
+          <w:i w:val="0"/>
+          <w:color w:val="000000"/>
+          <w:sz w:val="22"/>
+        </w:rPr>
+        <w:t>•  Sub-second keyword search and category filtering across hundreds of active announcements.</w:t>
+      </w:r>
+    </w:p>
+    <w:p>
+      <w:pPr>
+        <w:spacing w:after="60" w:before="0" w:line="276" w:lineRule="auto"/>
+        <w:jc w:val="left"/>
+      </w:pPr>
+      <w:r>
+        <w:rPr>
+          <w:rFonts w:ascii="Times New Roman" w:hAnsi="Times New Roman"/>
+          <w:b w:val="0"/>
+          <w:i w:val="0"/>
+          <w:color w:val="000000"/>
+          <w:sz w:val="22"/>
+        </w:rPr>
+        <w:t>•  Reliable data persistence surviving system restarts via Java File I/O and cloud synchronization.</w:t>
+      </w:r>
+    </w:p>
+    <w:p>
+      <w:pPr>
+        <w:spacing w:after="60" w:before="0" w:line="276" w:lineRule="auto"/>
+        <w:jc w:val="left"/>
+      </w:pPr>
+      <w:r>
+        <w:rPr>
+          <w:rFonts w:ascii="Times New Roman" w:hAnsi="Times New Roman"/>
+          <w:b w:val="0"/>
+          <w:i w:val="0"/>
+          <w:color w:val="000000"/>
+          <w:sz w:val="22"/>
+        </w:rPr>
+        <w:t>•  Clear role segregation between institutional administrators, faculty coordinators, and student viewers.</w:t>
+      </w:r>
+    </w:p>
+    <w:p>
+      <w:pPr>
+        <w:spacing w:after="60" w:before="0" w:line="276" w:lineRule="auto"/>
+        <w:jc w:val="left"/>
+      </w:pPr>
+      <w:r>
+        <w:rPr>
+          <w:rFonts w:ascii="Times New Roman" w:hAnsi="Times New Roman"/>
+          <w:b w:val="0"/>
+          <w:i w:val="0"/>
+          <w:color w:val="000000"/>
+          <w:sz w:val="22"/>
+        </w:rPr>
+        <w:t>•  100% verified system reliability validated through an automated 36-test architectural verification suite.</w:t>
+      </w:r>
+    </w:p>
+    <w:p>
+      <w:pPr>
+        <w:spacing w:after="80" w:before="160" w:line="276" w:lineRule="auto"/>
+        <w:jc w:val="left"/>
+      </w:pPr>
+      <w:r>
+        <w:rPr>
+          <w:rFonts w:ascii="Times New Roman" w:hAnsi="Times New Roman"/>
+          <w:b/>
+          <w:i w:val="0"/>
+          <w:color w:val="000000"/>
+          <w:sz w:val="24"/>
+        </w:rPr>
+        <w:t>8. Applications of the Project</w:t>
+      </w:r>
+    </w:p>
+    <w:p>
+      <w:pPr>
+        <w:spacing w:after="60" w:before="0" w:line="276" w:lineRule="auto"/>
+        <w:jc w:val="left"/>
+      </w:pPr>
+      <w:r>
+        <w:rPr>
+          <w:rFonts w:ascii="Times New Roman" w:hAnsi="Times New Roman"/>
+          <w:b w:val="0"/>
+          <w:i w:val="0"/>
+          <w:color w:val="000000"/>
+          <w:sz w:val="22"/>
+        </w:rPr>
+        <w:t>•  Engineering colleges and polytechnic campuses for daily circular broadcast.</w:t>
+      </w:r>
+    </w:p>
+    <w:p>
+      <w:pPr>
+        <w:spacing w:after="60" w:before="0" w:line="276" w:lineRule="auto"/>
+        <w:jc w:val="left"/>
+      </w:pPr>
+      <w:r>
+        <w:rPr>
+          <w:rFonts w:ascii="Times New Roman" w:hAnsi="Times New Roman"/>
+          <w:b w:val="0"/>
+          <w:i w:val="0"/>
+          <w:color w:val="000000"/>
+          <w:sz w:val="22"/>
+        </w:rPr>
+        <w:t>•  Examination Cells for publishing exam timetables, hall ticket alerts, and revaluation results.</w:t>
+      </w:r>
+    </w:p>
+    <w:p>
+      <w:pPr>
+        <w:spacing w:after="60" w:before="0" w:line="276" w:lineRule="auto"/>
+        <w:jc w:val="left"/>
+      </w:pPr>
+      <w:r>
+        <w:rPr>
+          <w:rFonts w:ascii="Times New Roman" w:hAnsi="Times New Roman"/>
+          <w:b w:val="0"/>
+          <w:i w:val="0"/>
+          <w:color w:val="000000"/>
+          <w:sz w:val="22"/>
+        </w:rPr>
+        <w:t>•  Training &amp; Placement (T&amp;P) Cells for recruitment drive notices, eligibility lists, and interview schedules.</w:t>
+      </w:r>
+    </w:p>
+    <w:p>
+      <w:pPr>
+        <w:spacing w:after="60" w:before="0" w:line="276" w:lineRule="auto"/>
+        <w:jc w:val="left"/>
+      </w:pPr>
+      <w:r>
+        <w:rPr>
+          <w:rFonts w:ascii="Times New Roman" w:hAnsi="Times New Roman"/>
+          <w:b w:val="0"/>
+          <w:i w:val="0"/>
+          <w:color w:val="000000"/>
+          <w:sz w:val="22"/>
+        </w:rPr>
+        <w:t>•  Student activity councils and technical committees for hackathon, seminar, and festival announcements.</w:t>
+      </w:r>
+    </w:p>
+    <w:p>
+      <w:pPr>
+        <w:spacing w:after="60" w:before="0" w:line="276" w:lineRule="auto"/>
+        <w:jc w:val="left"/>
+      </w:pPr>
+      <w:r>
+        <w:rPr>
+          <w:rFonts w:ascii="Times New Roman" w:hAnsi="Times New Roman"/>
+          <w:b w:val="0"/>
+          <w:i w:val="0"/>
+          <w:color w:val="000000"/>
+          <w:sz w:val="22"/>
+        </w:rPr>
+        <w:t>•  Educational demonstration of Core Java OOP, Collections, File I/O, and software engineering principles.</w:t>
+      </w:r>
+    </w:p>
+    <w:p>
+      <w:r>
+        <w:br w:type="page"/>
+      </w:r>
+    </w:p>
+    <w:p>
+      <w:pPr>
+        <w:spacing w:after="80" w:before="120" w:line="276" w:lineRule="auto"/>
+        <w:jc w:val="left"/>
+      </w:pPr>
+      <w:r>
+        <w:rPr>
+          <w:rFonts w:ascii="Times New Roman" w:hAnsi="Times New Roman"/>
+          <w:b/>
+          <w:i w:val="0"/>
+          <w:color w:val="000000"/>
+          <w:sz w:val="24"/>
+        </w:rPr>
+        <w:t>9. Limitations</w:t>
+      </w:r>
+    </w:p>
+    <w:p>
+      <w:pPr>
+        <w:spacing w:after="60" w:before="0" w:line="276" w:lineRule="auto"/>
+        <w:jc w:val="left"/>
+      </w:pPr>
+      <w:r>
+        <w:rPr>
+          <w:rFonts w:ascii="Times New Roman" w:hAnsi="Times New Roman"/>
+          <w:b w:val="0"/>
+          <w:i w:val="0"/>
+          <w:color w:val="000000"/>
+          <w:sz w:val="22"/>
+        </w:rPr>
+        <w:t>•  Terminal CLI driver requires a local Java Runtime Environment (JRE) installed on the host machine.</w:t>
+      </w:r>
+    </w:p>
+    <w:p>
+      <w:pPr>
+        <w:spacing w:after="60" w:before="0" w:line="276" w:lineRule="auto"/>
+        <w:jc w:val="left"/>
+      </w:pPr>
+      <w:r>
+        <w:rPr>
+          <w:rFonts w:ascii="Times New Roman" w:hAnsi="Times New Roman"/>
+          <w:b w:val="0"/>
+          <w:i w:val="0"/>
+          <w:color w:val="000000"/>
+          <w:sz w:val="22"/>
+        </w:rPr>
+        <w:t>•  Cloud synchronization requires an active internet connection (though local offline storage mode is fully functional).</w:t>
+      </w:r>
+    </w:p>
+    <w:p>
+      <w:pPr>
+        <w:spacing w:after="60" w:before="0" w:line="276" w:lineRule="auto"/>
+        <w:jc w:val="left"/>
+      </w:pPr>
+      <w:r>
+        <w:rPr>
+          <w:rFonts w:ascii="Times New Roman" w:hAnsi="Times New Roman"/>
+          <w:b w:val="0"/>
+          <w:i w:val="0"/>
+          <w:color w:val="000000"/>
+          <w:sz w:val="22"/>
+        </w:rPr>
+        <w:t>•  Current version is optimized for text notices and structured metadata; direct large video streaming is not accommodated.</w:t>
+      </w:r>
+    </w:p>
+    <w:p>
+      <w:pPr>
+        <w:spacing w:after="80" w:before="160" w:line="276" w:lineRule="auto"/>
+        <w:jc w:val="left"/>
+      </w:pPr>
+      <w:r>
+        <w:rPr>
+          <w:rFonts w:ascii="Times New Roman" w:hAnsi="Times New Roman"/>
+          <w:b/>
+          <w:i w:val="0"/>
+          <w:color w:val="000000"/>
+          <w:sz w:val="24"/>
+        </w:rPr>
+        <w:t>10. Conclusion</w:t>
+      </w:r>
+    </w:p>
+    <w:p>
+      <w:pPr>
+        <w:spacing w:after="240" w:before="0" w:line="276" w:lineRule="auto"/>
+        <w:jc w:val="left"/>
+      </w:pPr>
+      <w:r>
+        <w:rPr>
+          <w:rFonts w:ascii="Times New Roman" w:hAnsi="Times New Roman"/>
+          <w:b w:val="0"/>
+          <w:i w:val="0"/>
+          <w:color w:val="000000"/>
+          <w:sz w:val="22"/>
+        </w:rPr>
+        <w:t>The Campus Notify system provides an efficient, structured, and authentic digital solution for managing campus circulars and announcements. This mini project successfully demonstrates the practical application of Object-Oriented Programming, Java Collections Framework, File I/O persistence, and role governance in addressing real-world institutional communication bottlenecks.</w:t>
+      </w:r>
+    </w:p>
+    <w:p>
+      <w:pPr>
+        <w:spacing w:after="120" w:before="200" w:line="276" w:lineRule="auto"/>
+        <w:jc w:val="left"/>
+      </w:pPr>
+      <w:r>
+        <w:rPr>
+          <w:rFonts w:ascii="Times New Roman" w:hAnsi="Times New Roman"/>
+          <w:b/>
+          <w:i w:val="0"/>
+          <w:color w:val="000000"/>
+          <w:sz w:val="24"/>
+        </w:rPr>
+        <w:t>Signatures and Approvals</w:t>
       </w:r>
     </w:p>
     <w:tbl>
@@ -1017,10 +1318,10 @@
               <w:right w:val="single" w:sz="4" w:space="0" w:color="000000"/>
             </w:tcBorders>
             <w:tcMar>
-              <w:top w:w="60" w:type="dxa"/>
-              <w:bottom w:w="60" w:type="dxa"/>
-              <w:left w:w="60" w:type="dxa"/>
-              <w:right w:w="60" w:type="dxa"/>
+              <w:top w:w="50" w:type="dxa"/>
+              <w:bottom w:w="50" w:type="dxa"/>
+              <w:left w:w="50" w:type="dxa"/>
+              <w:right w:w="50" w:type="dxa"/>
             </w:tcMar>
           </w:tcPr>
           <w:p>
@@ -1049,10 +1350,10 @@
               <w:right w:val="single" w:sz="4" w:space="0" w:color="000000"/>
             </w:tcBorders>
             <w:tcMar>
-              <w:top w:w="60" w:type="dxa"/>
-              <w:bottom w:w="60" w:type="dxa"/>
-              <w:left w:w="60" w:type="dxa"/>
-              <w:right w:w="60" w:type="dxa"/>
+              <w:top w:w="50" w:type="dxa"/>
+              <w:bottom w:w="50" w:type="dxa"/>
+              <w:left w:w="50" w:type="dxa"/>
+              <w:right w:w="50" w:type="dxa"/>
             </w:tcMar>
           </w:tcPr>
           <w:p>
@@ -1081,10 +1382,10 @@
               <w:right w:val="single" w:sz="4" w:space="0" w:color="000000"/>
             </w:tcBorders>
             <w:tcMar>
-              <w:top w:w="60" w:type="dxa"/>
-              <w:bottom w:w="60" w:type="dxa"/>
-              <w:left w:w="60" w:type="dxa"/>
-              <w:right w:w="60" w:type="dxa"/>
+              <w:top w:w="50" w:type="dxa"/>
+              <w:bottom w:w="50" w:type="dxa"/>
+              <w:left w:w="50" w:type="dxa"/>
+              <w:right w:w="50" w:type="dxa"/>
             </w:tcMar>
           </w:tcPr>
           <w:p>
@@ -1115,10 +1416,10 @@
               <w:right w:val="single" w:sz="4" w:space="0" w:color="000000"/>
             </w:tcBorders>
             <w:tcMar>
-              <w:top w:w="60" w:type="dxa"/>
-              <w:bottom w:w="60" w:type="dxa"/>
-              <w:left w:w="60" w:type="dxa"/>
-              <w:right w:w="60" w:type="dxa"/>
+              <w:top w:w="50" w:type="dxa"/>
+              <w:bottom w:w="50" w:type="dxa"/>
+              <w:left w:w="50" w:type="dxa"/>
+              <w:right w:w="50" w:type="dxa"/>
             </w:tcMar>
           </w:tcPr>
           <w:p>
@@ -1135,11 +1436,17 @@
               </w:rPr>
               <w:t>1. ___________________</w:t>
               <w:br/>
+              <w:t>(PRATIK ATPADKAR)</w:t>
+              <w:br/>
+              <w:br/>
               <w:t>2. ___________________</w:t>
+              <w:br/>
+              <w:t>(HARSH TIWAR)</w:t>
+              <w:br/>
               <w:br/>
               <w:t>3. ___________________</w:t>
               <w:br/>
-              <w:t>4. ___________________</w:t>
+              <w:t>(PARTH GADADHE)</w:t>
             </w:r>
           </w:p>
         </w:tc>
@@ -1153,10 +1460,10 @@
               <w:right w:val="single" w:sz="4" w:space="0" w:color="000000"/>
             </w:tcBorders>
             <w:tcMar>
-              <w:top w:w="60" w:type="dxa"/>
-              <w:bottom w:w="60" w:type="dxa"/>
-              <w:left w:w="60" w:type="dxa"/>
-              <w:right w:w="60" w:type="dxa"/>
+              <w:top w:w="50" w:type="dxa"/>
+              <w:bottom w:w="50" w:type="dxa"/>
+              <w:left w:w="50" w:type="dxa"/>
+              <w:right w:w="50" w:type="dxa"/>
             </w:tcMar>
           </w:tcPr>
           <w:p>
@@ -1173,7 +1480,10 @@
               </w:rPr>
               <w:t>_______________________</w:t>
               <w:br/>
-              <w:t>Prof. _________________</w:t>
+              <w:br/>
+              <w:t>Prof. Sonali Kharat</w:t>
+              <w:br/>
+              <w:t>Project Guide</w:t>
               <w:br/>
               <w:t>Dept. of IT</w:t>
             </w:r>
@@ -1189,10 +1499,10 @@
               <w:right w:val="single" w:sz="4" w:space="0" w:color="000000"/>
             </w:tcBorders>
             <w:tcMar>
-              <w:top w:w="60" w:type="dxa"/>
-              <w:bottom w:w="60" w:type="dxa"/>
-              <w:left w:w="60" w:type="dxa"/>
-              <w:right w:w="60" w:type="dxa"/>
+              <w:top w:w="50" w:type="dxa"/>
+              <w:bottom w:w="50" w:type="dxa"/>
+              <w:left w:w="50" w:type="dxa"/>
+              <w:right w:w="50" w:type="dxa"/>
             </w:tcMar>
           </w:tcPr>
           <w:p>
@@ -1208,6 +1518,9 @@
                 <w:sz w:val="19"/>
               </w:rPr>
               <w:t>_______________________</w:t>
+              <w:br/>
+              <w:br/>
+              <w:t>Dr. Pradip Mane</w:t>
               <w:br/>
               <w:t>Head of Department</w:t>
               <w:br/>

</xml_diff>